<commit_message>
docs(brd): re-emit the package after the shared rebuild
Content verified identical to the previous commit, paragraph for
paragraph: 16 pages, 6,963 words, 22 table-of-contents entries, 15 tables
and 4 figures either side. The assembler writes both documents together,
so rebuilding for the Solution Design Document re-zipped this one as
well; only the archive bytes moved. Committed rather than left as an
unexplained modified file.
</commit_message>
<xml_diff>
--- a/docs/SIMF-BRD-001-Business-Requirements-Document-EN-v2.0.docx
+++ b/docs/SIMF-BRD-001-Business-Requirements-Document-EN-v2.0.docx
@@ -11,7 +11,7 @@
           <w:noProof/>
         </w:rPr>
         <w:drawing>
-          <wp:inline distT="0" distB="0" distL="0" distR="0" wp14:anchorId="7F9A9428" wp14:editId="6832B5EB">
+          <wp:inline distT="0" distB="0" distL="0" distR="0" wp14:anchorId="29B2A2DB" wp14:editId="451E719E">
             <wp:extent cx="2587752" cy="944734"/>
             <wp:effectExtent l="0" t="0" r="0" b="0"/>
             <wp:docPr id="1" name="Picture 1"/>
@@ -1518,7 +1518,7 @@
       <w:r>
         <w:fldChar w:fldCharType="separate"/>
       </w:r>
-      <w:hyperlink w:anchor="_Toc239445939" w:history="1">
+      <w:hyperlink w:anchor="_Toc239446358" w:history="1">
         <w:r>
           <w:rPr>
             <w:rStyle w:val="Hyperlink"/>
@@ -1545,7 +1545,7 @@
             <w:noProof/>
             <w:webHidden/>
           </w:rPr>
-          <w:instrText xml:space="preserve"> PAGEREF _Toc239445939 \h </w:instrText>
+          <w:instrText xml:space="preserve"> PAGEREF _Toc239446358 \h </w:instrText>
         </w:r>
         <w:r>
           <w:rPr>
@@ -1590,7 +1590,7 @@
           <w14:ligatures w14:val="standardContextual"/>
         </w:rPr>
       </w:pPr>
-      <w:hyperlink w:anchor="_Toc239445940" w:history="1">
+      <w:hyperlink w:anchor="_Toc239446359" w:history="1">
         <w:r>
           <w:rPr>
             <w:rStyle w:val="Hyperlink"/>
@@ -1617,7 +1617,7 @@
             <w:noProof/>
             <w:webHidden/>
           </w:rPr>
-          <w:instrText xml:space="preserve"> PAGEREF _Toc239445940 \h </w:instrText>
+          <w:instrText xml:space="preserve"> PAGEREF _Toc239446359 \h </w:instrText>
         </w:r>
         <w:r>
           <w:rPr>
@@ -1662,7 +1662,7 @@
           <w14:ligatures w14:val="standardContextual"/>
         </w:rPr>
       </w:pPr>
-      <w:hyperlink w:anchor="_Toc239445941" w:history="1">
+      <w:hyperlink w:anchor="_Toc239446360" w:history="1">
         <w:r>
           <w:rPr>
             <w:rStyle w:val="Hyperlink"/>
@@ -1689,7 +1689,7 @@
             <w:noProof/>
             <w:webHidden/>
           </w:rPr>
-          <w:instrText xml:space="preserve"> PAGEREF _Toc239445941 \h </w:instrText>
+          <w:instrText xml:space="preserve"> PAGEREF _Toc239446360 \h </w:instrText>
         </w:r>
         <w:r>
           <w:rPr>
@@ -1734,7 +1734,7 @@
           <w14:ligatures w14:val="standardContextual"/>
         </w:rPr>
       </w:pPr>
-      <w:hyperlink w:anchor="_Toc239445942" w:history="1">
+      <w:hyperlink w:anchor="_Toc239446361" w:history="1">
         <w:r>
           <w:rPr>
             <w:rStyle w:val="Hyperlink"/>
@@ -1761,7 +1761,7 @@
             <w:noProof/>
             <w:webHidden/>
           </w:rPr>
-          <w:instrText xml:space="preserve"> PAGEREF _Toc239445942 \h </w:instrText>
+          <w:instrText xml:space="preserve"> PAGEREF _Toc239446361 \h </w:instrText>
         </w:r>
         <w:r>
           <w:rPr>
@@ -1806,7 +1806,7 @@
           <w14:ligatures w14:val="standardContextual"/>
         </w:rPr>
       </w:pPr>
-      <w:hyperlink w:anchor="_Toc239445943" w:history="1">
+      <w:hyperlink w:anchor="_Toc239446362" w:history="1">
         <w:r>
           <w:rPr>
             <w:rStyle w:val="Hyperlink"/>
@@ -1833,7 +1833,7 @@
             <w:noProof/>
             <w:webHidden/>
           </w:rPr>
-          <w:instrText xml:space="preserve"> PAGEREF _Toc239445943 \h </w:instrText>
+          <w:instrText xml:space="preserve"> PAGEREF _Toc239446362 \h </w:instrText>
         </w:r>
         <w:r>
           <w:rPr>
@@ -1878,7 +1878,7 @@
           <w14:ligatures w14:val="standardContextual"/>
         </w:rPr>
       </w:pPr>
-      <w:hyperlink w:anchor="_Toc239445944" w:history="1">
+      <w:hyperlink w:anchor="_Toc239446363" w:history="1">
         <w:r>
           <w:rPr>
             <w:rStyle w:val="Hyperlink"/>
@@ -1905,7 +1905,7 @@
             <w:noProof/>
             <w:webHidden/>
           </w:rPr>
-          <w:instrText xml:space="preserve"> PAGEREF _Toc239445944 \h </w:instrText>
+          <w:instrText xml:space="preserve"> PAGEREF _Toc239446363 \h </w:instrText>
         </w:r>
         <w:r>
           <w:rPr>
@@ -1950,7 +1950,7 @@
           <w14:ligatures w14:val="standardContextual"/>
         </w:rPr>
       </w:pPr>
-      <w:hyperlink w:anchor="_Toc239445945" w:history="1">
+      <w:hyperlink w:anchor="_Toc239446364" w:history="1">
         <w:r>
           <w:rPr>
             <w:rStyle w:val="Hyperlink"/>
@@ -1977,7 +1977,7 @@
             <w:noProof/>
             <w:webHidden/>
           </w:rPr>
-          <w:instrText xml:space="preserve"> PAGEREF _Toc239445945 \h </w:instrText>
+          <w:instrText xml:space="preserve"> PAGEREF _Toc239446364 \h </w:instrText>
         </w:r>
         <w:r>
           <w:rPr>
@@ -2022,7 +2022,7 @@
           <w14:ligatures w14:val="standardContextual"/>
         </w:rPr>
       </w:pPr>
-      <w:hyperlink w:anchor="_Toc239445946" w:history="1">
+      <w:hyperlink w:anchor="_Toc239446365" w:history="1">
         <w:r>
           <w:rPr>
             <w:rStyle w:val="Hyperlink"/>
@@ -2049,7 +2049,7 @@
             <w:noProof/>
             <w:webHidden/>
           </w:rPr>
-          <w:instrText xml:space="preserve"> PAGEREF _Toc239445946 \h </w:instrText>
+          <w:instrText xml:space="preserve"> PAGEREF _Toc239446365 \h </w:instrText>
         </w:r>
         <w:r>
           <w:rPr>
@@ -2094,7 +2094,7 @@
           <w14:ligatures w14:val="standardContextual"/>
         </w:rPr>
       </w:pPr>
-      <w:hyperlink w:anchor="_Toc239445947" w:history="1">
+      <w:hyperlink w:anchor="_Toc239446366" w:history="1">
         <w:r>
           <w:rPr>
             <w:rStyle w:val="Hyperlink"/>
@@ -2121,7 +2121,7 @@
             <w:noProof/>
             <w:webHidden/>
           </w:rPr>
-          <w:instrText xml:space="preserve"> PAGEREF _Toc239445947 \h </w:instrText>
+          <w:instrText xml:space="preserve"> PAGEREF _Toc239446366 \h </w:instrText>
         </w:r>
         <w:r>
           <w:rPr>
@@ -2166,7 +2166,7 @@
           <w14:ligatures w14:val="standardContextual"/>
         </w:rPr>
       </w:pPr>
-      <w:hyperlink w:anchor="_Toc239445948" w:history="1">
+      <w:hyperlink w:anchor="_Toc239446367" w:history="1">
         <w:r>
           <w:rPr>
             <w:rStyle w:val="Hyperlink"/>
@@ -2193,7 +2193,7 @@
             <w:noProof/>
             <w:webHidden/>
           </w:rPr>
-          <w:instrText xml:space="preserve"> PAGEREF _Toc239445948 \h </w:instrText>
+          <w:instrText xml:space="preserve"> PAGEREF _Toc239446367 \h </w:instrText>
         </w:r>
         <w:r>
           <w:rPr>
@@ -2238,7 +2238,7 @@
           <w14:ligatures w14:val="standardContextual"/>
         </w:rPr>
       </w:pPr>
-      <w:hyperlink w:anchor="_Toc239445949" w:history="1">
+      <w:hyperlink w:anchor="_Toc239446368" w:history="1">
         <w:r>
           <w:rPr>
             <w:rStyle w:val="Hyperlink"/>
@@ -2265,7 +2265,7 @@
             <w:noProof/>
             <w:webHidden/>
           </w:rPr>
-          <w:instrText xml:space="preserve"> PAGEREF _Toc239445949 \h </w:instrText>
+          <w:instrText xml:space="preserve"> PAGEREF _Toc239446368 \h </w:instrText>
         </w:r>
         <w:r>
           <w:rPr>
@@ -2310,7 +2310,7 @@
           <w14:ligatures w14:val="standardContextual"/>
         </w:rPr>
       </w:pPr>
-      <w:hyperlink w:anchor="_Toc239445950" w:history="1">
+      <w:hyperlink w:anchor="_Toc239446369" w:history="1">
         <w:r>
           <w:rPr>
             <w:rStyle w:val="Hyperlink"/>
@@ -2337,7 +2337,7 @@
             <w:noProof/>
             <w:webHidden/>
           </w:rPr>
-          <w:instrText xml:space="preserve"> PAGEREF _Toc239445950 \h </w:instrText>
+          <w:instrText xml:space="preserve"> PAGEREF _Toc239446369 \h </w:instrText>
         </w:r>
         <w:r>
           <w:rPr>
@@ -2382,7 +2382,7 @@
           <w14:ligatures w14:val="standardContextual"/>
         </w:rPr>
       </w:pPr>
-      <w:hyperlink w:anchor="_Toc239445951" w:history="1">
+      <w:hyperlink w:anchor="_Toc239446370" w:history="1">
         <w:r>
           <w:rPr>
             <w:rStyle w:val="Hyperlink"/>
@@ -2409,7 +2409,7 @@
             <w:noProof/>
             <w:webHidden/>
           </w:rPr>
-          <w:instrText xml:space="preserve"> PAGEREF _Toc239445951 \h </w:instrText>
+          <w:instrText xml:space="preserve"> PAGEREF _Toc239446370 \h </w:instrText>
         </w:r>
         <w:r>
           <w:rPr>
@@ -2454,7 +2454,7 @@
           <w14:ligatures w14:val="standardContextual"/>
         </w:rPr>
       </w:pPr>
-      <w:hyperlink w:anchor="_Toc239445952" w:history="1">
+      <w:hyperlink w:anchor="_Toc239446371" w:history="1">
         <w:r>
           <w:rPr>
             <w:rStyle w:val="Hyperlink"/>
@@ -2481,7 +2481,7 @@
             <w:noProof/>
             <w:webHidden/>
           </w:rPr>
-          <w:instrText xml:space="preserve"> PAGEREF _Toc239445952 \h </w:instrText>
+          <w:instrText xml:space="preserve"> PAGEREF _Toc239446371 \h </w:instrText>
         </w:r>
         <w:r>
           <w:rPr>
@@ -2526,7 +2526,7 @@
           <w14:ligatures w14:val="standardContextual"/>
         </w:rPr>
       </w:pPr>
-      <w:hyperlink w:anchor="_Toc239445953" w:history="1">
+      <w:hyperlink w:anchor="_Toc239446372" w:history="1">
         <w:r>
           <w:rPr>
             <w:rStyle w:val="Hyperlink"/>
@@ -2553,7 +2553,7 @@
             <w:noProof/>
             <w:webHidden/>
           </w:rPr>
-          <w:instrText xml:space="preserve"> PAGEREF _Toc239445953 \h </w:instrText>
+          <w:instrText xml:space="preserve"> PAGEREF _Toc239446372 \h </w:instrText>
         </w:r>
         <w:r>
           <w:rPr>
@@ -2598,7 +2598,7 @@
           <w14:ligatures w14:val="standardContextual"/>
         </w:rPr>
       </w:pPr>
-      <w:hyperlink w:anchor="_Toc239445954" w:history="1">
+      <w:hyperlink w:anchor="_Toc239446373" w:history="1">
         <w:r>
           <w:rPr>
             <w:rStyle w:val="Hyperlink"/>
@@ -2625,7 +2625,7 @@
             <w:noProof/>
             <w:webHidden/>
           </w:rPr>
-          <w:instrText xml:space="preserve"> PAGEREF _Toc239445954 \h </w:instrText>
+          <w:instrText xml:space="preserve"> PAGEREF _Toc239446373 \h </w:instrText>
         </w:r>
         <w:r>
           <w:rPr>
@@ -2670,7 +2670,7 @@
           <w14:ligatures w14:val="standardContextual"/>
         </w:rPr>
       </w:pPr>
-      <w:hyperlink w:anchor="_Toc239445955" w:history="1">
+      <w:hyperlink w:anchor="_Toc239446374" w:history="1">
         <w:r>
           <w:rPr>
             <w:rStyle w:val="Hyperlink"/>
@@ -2697,7 +2697,7 @@
             <w:noProof/>
             <w:webHidden/>
           </w:rPr>
-          <w:instrText xml:space="preserve"> PAGEREF _Toc239445955 \h </w:instrText>
+          <w:instrText xml:space="preserve"> PAGEREF _Toc239446374 \h </w:instrText>
         </w:r>
         <w:r>
           <w:rPr>
@@ -2742,7 +2742,7 @@
           <w14:ligatures w14:val="standardContextual"/>
         </w:rPr>
       </w:pPr>
-      <w:hyperlink w:anchor="_Toc239445956" w:history="1">
+      <w:hyperlink w:anchor="_Toc239446375" w:history="1">
         <w:r>
           <w:rPr>
             <w:rStyle w:val="Hyperlink"/>
@@ -2769,7 +2769,7 @@
             <w:noProof/>
             <w:webHidden/>
           </w:rPr>
-          <w:instrText xml:space="preserve"> PAGEREF _Toc239445956 \h </w:instrText>
+          <w:instrText xml:space="preserve"> PAGEREF _Toc239446375 \h </w:instrText>
         </w:r>
         <w:r>
           <w:rPr>
@@ -2814,7 +2814,7 @@
           <w14:ligatures w14:val="standardContextual"/>
         </w:rPr>
       </w:pPr>
-      <w:hyperlink w:anchor="_Toc239445957" w:history="1">
+      <w:hyperlink w:anchor="_Toc239446376" w:history="1">
         <w:r>
           <w:rPr>
             <w:rStyle w:val="Hyperlink"/>
@@ -2841,7 +2841,7 @@
             <w:noProof/>
             <w:webHidden/>
           </w:rPr>
-          <w:instrText xml:space="preserve"> PAGEREF _Toc239445957 \h </w:instrText>
+          <w:instrText xml:space="preserve"> PAGEREF _Toc239446376 \h </w:instrText>
         </w:r>
         <w:r>
           <w:rPr>
@@ -2886,7 +2886,7 @@
           <w14:ligatures w14:val="standardContextual"/>
         </w:rPr>
       </w:pPr>
-      <w:hyperlink w:anchor="_Toc239445958" w:history="1">
+      <w:hyperlink w:anchor="_Toc239446377" w:history="1">
         <w:r>
           <w:rPr>
             <w:rStyle w:val="Hyperlink"/>
@@ -2913,7 +2913,7 @@
             <w:noProof/>
             <w:webHidden/>
           </w:rPr>
-          <w:instrText xml:space="preserve"> PAGEREF _Toc239445958 \h </w:instrText>
+          <w:instrText xml:space="preserve"> PAGEREF _Toc239446377 \h </w:instrText>
         </w:r>
         <w:r>
           <w:rPr>
@@ -2958,7 +2958,7 @@
           <w14:ligatures w14:val="standardContextual"/>
         </w:rPr>
       </w:pPr>
-      <w:hyperlink w:anchor="_Toc239445959" w:history="1">
+      <w:hyperlink w:anchor="_Toc239446378" w:history="1">
         <w:r>
           <w:rPr>
             <w:rStyle w:val="Hyperlink"/>
@@ -2985,7 +2985,7 @@
             <w:noProof/>
             <w:webHidden/>
           </w:rPr>
-          <w:instrText xml:space="preserve"> PAGEREF _Toc239445959 \h </w:instrText>
+          <w:instrText xml:space="preserve"> PAGEREF _Toc239446378 \h </w:instrText>
         </w:r>
         <w:r>
           <w:rPr>
@@ -4004,7 +4004,7 @@
       <w:pPr>
         <w:pStyle w:val="Heading1"/>
       </w:pPr>
-      <w:bookmarkStart w:id="0" w:name="_Toc239445939"/>
+      <w:bookmarkStart w:id="0" w:name="_Toc239446358"/>
       <w:r>
         <w:t>1. Introduction</w:t>
       </w:r>
@@ -4014,7 +4014,7 @@
       <w:pPr>
         <w:pStyle w:val="Heading2"/>
       </w:pPr>
-      <w:bookmarkStart w:id="1" w:name="_Toc239445940"/>
+      <w:bookmarkStart w:id="1" w:name="_Toc239446359"/>
       <w:r>
         <w:t>1.1 Document Purpose</w:t>
       </w:r>
@@ -4048,7 +4048,7 @@
       <w:pPr>
         <w:pStyle w:val="Heading2"/>
       </w:pPr>
-      <w:bookmarkStart w:id="2" w:name="_Toc239445941"/>
+      <w:bookmarkStart w:id="2" w:name="_Toc239446360"/>
       <w:r>
         <w:t>1.2 Roles and Responsibilities</w:t>
       </w:r>
@@ -4286,7 +4286,7 @@
       <w:pPr>
         <w:pStyle w:val="Heading1"/>
       </w:pPr>
-      <w:bookmarkStart w:id="3" w:name="_Toc239445942"/>
+      <w:bookmarkStart w:id="3" w:name="_Toc239446361"/>
       <w:r>
         <w:t>2. Overview</w:t>
       </w:r>
@@ -4296,7 +4296,7 @@
       <w:pPr>
         <w:pStyle w:val="Heading2"/>
       </w:pPr>
-      <w:bookmarkStart w:id="4" w:name="_Toc239445943"/>
+      <w:bookmarkStart w:id="4" w:name="_Toc239446362"/>
       <w:r>
         <w:t>2.1 Problem Description</w:t>
       </w:r>
@@ -4322,7 +4322,7 @@
       <w:pPr>
         <w:pStyle w:val="Heading2"/>
       </w:pPr>
-      <w:bookmarkStart w:id="5" w:name="_Toc239445944"/>
+      <w:bookmarkStart w:id="5" w:name="_Toc239446363"/>
       <w:r>
         <w:t>2.2 Current Situation (As-Is)</w:t>
       </w:r>
@@ -4348,7 +4348,7 @@
       <w:pPr>
         <w:pStyle w:val="Heading2"/>
       </w:pPr>
-      <w:bookmarkStart w:id="6" w:name="_Toc239445945"/>
+      <w:bookmarkStart w:id="6" w:name="_Toc239446364"/>
       <w:r>
         <w:t>2.3 Proposed Solution (To-Be)</w:t>
       </w:r>
@@ -4382,7 +4382,7 @@
       <w:pPr>
         <w:pStyle w:val="Heading3"/>
       </w:pPr>
-      <w:bookmarkStart w:id="7" w:name="_Toc239445946"/>
+      <w:bookmarkStart w:id="7" w:name="_Toc239446365"/>
       <w:r>
         <w:t>2.3.1 Objectives and Key Benefits</w:t>
       </w:r>
@@ -4492,7 +4492,7 @@
       <w:pPr>
         <w:pStyle w:val="Heading3"/>
       </w:pPr>
-      <w:bookmarkStart w:id="8" w:name="_Toc239445947"/>
+      <w:bookmarkStart w:id="8" w:name="_Toc239446366"/>
       <w:r>
         <w:t>2.3.2 Scope</w:t>
       </w:r>
@@ -4612,7 +4612,7 @@
       <w:pPr>
         <w:pStyle w:val="Heading3"/>
       </w:pPr>
-      <w:bookmarkStart w:id="9" w:name="_Toc239445948"/>
+      <w:bookmarkStart w:id="9" w:name="_Toc239446367"/>
       <w:r>
         <w:t>2.3.3 Out of Scope</w:t>
       </w:r>
@@ -4711,7 +4711,7 @@
       <w:pPr>
         <w:pStyle w:val="Heading1"/>
       </w:pPr>
-      <w:bookmarkStart w:id="10" w:name="_Toc239445949"/>
+      <w:bookmarkStart w:id="10" w:name="_Toc239446368"/>
       <w:r>
         <w:t>3. Business Process</w:t>
       </w:r>
@@ -4812,7 +4812,7 @@
         </w:rPr>
         <w:lastRenderedPageBreak/>
         <w:drawing>
-          <wp:inline distT="0" distB="0" distL="0" distR="0" wp14:anchorId="7C79EE14" wp14:editId="6CAF832D">
+          <wp:inline distT="0" distB="0" distL="0" distR="0" wp14:anchorId="3BF98DDE" wp14:editId="6FC464D2">
             <wp:extent cx="6120130" cy="5238416"/>
             <wp:effectExtent l="0" t="0" r="0" b="0"/>
             <wp:docPr id="2" name="Picture 2"/>
@@ -4870,7 +4870,7 @@
         </w:rPr>
         <w:lastRenderedPageBreak/>
         <w:drawing>
-          <wp:inline distT="0" distB="0" distL="0" distR="0" wp14:anchorId="244856C0" wp14:editId="0634D1E7">
+          <wp:inline distT="0" distB="0" distL="0" distR="0" wp14:anchorId="5C5CD110" wp14:editId="6FCD278E">
             <wp:extent cx="6120130" cy="5808937"/>
             <wp:effectExtent l="0" t="0" r="0" b="0"/>
             <wp:docPr id="3" name="Picture 3"/>
@@ -4928,7 +4928,7 @@
         </w:rPr>
         <w:lastRenderedPageBreak/>
         <w:drawing>
-          <wp:inline distT="0" distB="0" distL="0" distR="0" wp14:anchorId="33654FB4" wp14:editId="50AF7C7D">
+          <wp:inline distT="0" distB="0" distL="0" distR="0" wp14:anchorId="2C735D23" wp14:editId="60C8C694">
             <wp:extent cx="6120130" cy="5497744"/>
             <wp:effectExtent l="0" t="0" r="0" b="0"/>
             <wp:docPr id="4" name="Picture 4"/>
@@ -4980,7 +4980,7 @@
       <w:pPr>
         <w:pStyle w:val="Heading1"/>
       </w:pPr>
-      <w:bookmarkStart w:id="11" w:name="_Toc239445950"/>
+      <w:bookmarkStart w:id="11" w:name="_Toc239446369"/>
       <w:r>
         <w:t>4. System Roles</w:t>
       </w:r>
@@ -5385,7 +5385,7 @@
       <w:pPr>
         <w:pStyle w:val="Heading1"/>
       </w:pPr>
-      <w:bookmarkStart w:id="12" w:name="_Toc239445951"/>
+      <w:bookmarkStart w:id="12" w:name="_Toc239446370"/>
       <w:r>
         <w:lastRenderedPageBreak/>
         <w:t>5. System Requirements</w:t>
@@ -5410,7 +5410,7 @@
       <w:pPr>
         <w:pStyle w:val="Heading2"/>
       </w:pPr>
-      <w:bookmarkStart w:id="13" w:name="_Toc239445952"/>
+      <w:bookmarkStart w:id="13" w:name="_Toc239446371"/>
       <w:r>
         <w:t>5.1 Business Rules</w:t>
       </w:r>
@@ -5856,7 +5856,7 @@
       <w:pPr>
         <w:pStyle w:val="Heading2"/>
       </w:pPr>
-      <w:bookmarkStart w:id="14" w:name="_Toc239445953"/>
+      <w:bookmarkStart w:id="14" w:name="_Toc239446372"/>
       <w:r>
         <w:t>5.2 User Requirements</w:t>
       </w:r>
@@ -10870,7 +10870,7 @@
       <w:pPr>
         <w:pStyle w:val="Heading2"/>
       </w:pPr>
-      <w:bookmarkStart w:id="15" w:name="_Toc239445954"/>
+      <w:bookmarkStart w:id="15" w:name="_Toc239446373"/>
       <w:r>
         <w:t>5.3 Operational Requirements</w:t>
       </w:r>
@@ -11372,7 +11372,7 @@
       <w:pPr>
         <w:pStyle w:val="Heading2"/>
       </w:pPr>
-      <w:bookmarkStart w:id="16" w:name="_Toc239445955"/>
+      <w:bookmarkStart w:id="16" w:name="_Toc239446374"/>
       <w:r>
         <w:t>5.4 Non-Functional Requirements</w:t>
       </w:r>
@@ -11776,7 +11776,7 @@
       <w:pPr>
         <w:pStyle w:val="Heading2"/>
       </w:pPr>
-      <w:bookmarkStart w:id="17" w:name="_Toc239445956"/>
+      <w:bookmarkStart w:id="17" w:name="_Toc239446375"/>
       <w:r>
         <w:t>5.5 Constraints</w:t>
       </w:r>
@@ -11885,7 +11885,7 @@
       <w:pPr>
         <w:pStyle w:val="Heading2"/>
       </w:pPr>
-      <w:bookmarkStart w:id="18" w:name="_Toc239445957"/>
+      <w:bookmarkStart w:id="18" w:name="_Toc239446376"/>
       <w:r>
         <w:t>5.6 Assumptions</w:t>
       </w:r>
@@ -11928,7 +11928,7 @@
       <w:pPr>
         <w:pStyle w:val="Heading2"/>
       </w:pPr>
-      <w:bookmarkStart w:id="19" w:name="_Toc239445958"/>
+      <w:bookmarkStart w:id="19" w:name="_Toc239446377"/>
       <w:r>
         <w:t>5.7 Open Items</w:t>
       </w:r>
@@ -12169,7 +12169,7 @@
       <w:pPr>
         <w:pStyle w:val="Heading1"/>
       </w:pPr>
-      <w:bookmarkStart w:id="20" w:name="_Toc239445959"/>
+      <w:bookmarkStart w:id="20" w:name="_Toc239446378"/>
       <w:r>
         <w:lastRenderedPageBreak/>
         <w:t>6. Attachments</w:t>

</xml_diff>